<commit_message>
Publish weekly summary 2026-07-29
</commit_message>
<xml_diff>
--- a/docs/weekly/FedWatch-Weekly-2026-07-29.docx
+++ b/docs/weekly/FedWatch-Weekly-2026-07-29.docx
@@ -35,82 +35,128 @@
     </w:p>
     <w:p>
       <w:r>
-        <w:t># Federal Research-Policy Summary</w:t>
+        <w:rPr>
+          <w:b/>
+          <w:color w:val="012169"/>
+        </w:rPr>
+        <w:t>Federal Research-Policy Summary: July 23–29, 2026</w:t>
       </w:r>
     </w:p>
     <w:p>
       <w:r>
-        <w:t>**Week of July 23–29, 2026**</w:t>
+        <w:rPr>
+          <w:b/>
+        </w:rPr>
+        <w:t>Bottom line:</w:t>
+      </w:r>
+      <w:r>
+        <w:t xml:space="preserve"> The White House this week proposed the most sweeping restructuring of federal research funding in over 80 years, explicitly aiming to reduce funding to leading universities in favor of individual investigators, AI initiatives, and new mission-driven organizations. In parallel, NIH resumed terminating grants tied to disfavored topics—with court records now exposing the keyword lists driving cancellations—and new biosafety and civil-rights developments add near-term compliance considerations. Together these carry direct financial, legal, and operational exposure for Emory's research enterprise.</w:t>
       </w:r>
     </w:p>
     <w:p>
       <w:r>
-        <w:t>**Bottom line:** The White House this week proposed the most significant restructuring of federal science funding in decades, explicitly seeking to reduce research support to major universities and redirect it toward individual investigators, AI initiatives, and new mission-driven organizations. In parallel, NIH resumed terminating grants tied to disfavored topics—with court records now exposing the keyword lists driving cancellations—and DoD expanded its blacklist of Chinese universities. Collectively, these developments carry direct financial, legal, and compliance exposure for the institution.</w:t>
+        <w:rPr>
+          <w:b/>
+        </w:rPr>
+        <w:t>Key developments</w:t>
       </w:r>
     </w:p>
     <w:p>
       <w:r>
-        <w:t>**Key developments**</w:t>
+        <w:t>Science funding restructuring</w:t>
+      </w:r>
+    </w:p>
+    <w:p>
+      <w:pPr>
+        <w:pStyle w:val="ListBullet"/>
+      </w:pPr>
+      <w:r>
+        <w:t>The White House unveiled a proposed overhaul centering AI and seeking alternatives to peer review; major agencies ($3B+ in FY2026 R&amp;D) must submit implementation plans within 90 days.</w:t>
+      </w:r>
+    </w:p>
+    <w:p>
+      <w:pPr>
+        <w:pStyle w:val="ListBullet"/>
+      </w:pPr>
+      <w:r>
+        <w:t>OSTP Director Kratsios's "Golden Age" report characterizes the U.S. science system as "calcified" and recommends cutting funding to leading universities, replacing investigator-led grants with large "grand challenge" team awards, and redirecting support toward individual scientists and new organizations.</w:t>
+      </w:r>
+    </w:p>
+    <w:p>
+      <w:pPr>
+        <w:pStyle w:val="ListBullet"/>
+      </w:pPr>
+      <w:r>
+        <w:t>A related strategy would fund individual "blue-sky" researchers who then select host institutions—a shift that threatens the traditional institutional funding model.</w:t>
       </w:r>
     </w:p>
     <w:p>
       <w:r>
-        <w:t>*Science funding restructuring*</w:t>
+        <w:t>Grant terminations and keyword screening</w:t>
+      </w:r>
+    </w:p>
+    <w:p>
+      <w:pPr>
+        <w:pStyle w:val="ListBullet"/>
+      </w:pPr>
+      <w:r>
+        <w:t>NIH has resumed canceling grants conflicting with administration priorities despite prior court rulings; active and pending awards on sensitive topics face renewed termination risk.</w:t>
+      </w:r>
+    </w:p>
+    <w:p>
+      <w:pPr>
+        <w:pStyle w:val="ListBullet"/>
+      </w:pPr>
+      <w:r>
+        <w:t>Agencies acknowledged using automated keyword lists (diversity, gender, COVID terms) to terminate roughly $2B in University of California grants, now challenged as unconstitutional. Court records exposing the specific terms allow us to proactively audit our portfolio and proposal language.</w:t>
       </w:r>
     </w:p>
     <w:p>
       <w:r>
-        <w:t>- The White House unveiled a sweeping overhaul of federal research, characterizing the U.S. science system as "calcified" and centering AI. Agencies with $3B+ in FY2026 R&amp;D must submit implementation plans within 90 days.</w:t>
+        <w:t>Compliance and research security</w:t>
+      </w:r>
+    </w:p>
+    <w:p>
+      <w:pPr>
+        <w:pStyle w:val="ListBullet"/>
+      </w:pPr>
+      <w:r>
+        <w:t>NIH issued NOT-OD-26-101 establishing USG policy for stopping high-risk life sciences research; oversight, biosafety, and compliance offices should assess implications for affected labs and awards.</w:t>
+      </w:r>
+    </w:p>
+    <w:p>
+      <w:pPr>
+        <w:pStyle w:val="ListBullet"/>
+      </w:pPr>
+      <w:r>
+        <w:t>HHS rescinded portions of its Title VI civil rights regulations to align with EO 14281, potentially narrowing compliance obligations tied to federal funding.</w:t>
+      </w:r>
+    </w:p>
+    <w:p>
+      <w:pPr>
+        <w:pStyle w:val="ListBullet"/>
+      </w:pPr>
+      <w:r>
+        <w:t>The Pentagon expanded its threat list to include Fudan and Shanghai Jiao Tong, complicating collaborations with leading Chinese civilian institutions.</w:t>
+      </w:r>
+    </w:p>
+    <w:p>
+      <w:pPr>
+        <w:pStyle w:val="ListBullet"/>
+      </w:pPr>
+      <w:r>
+        <w:t>The FDA finalized three cancer clinical-trial eligibility guidances (routine; relevant to IRBs and oncology investigators).</w:t>
       </w:r>
     </w:p>
     <w:p>
       <w:r>
-        <w:t>- OSTP Director Kratsios's "Golden Age" report recommends cutting funding to leading universities, replacing investigator-led grants with large team "grand challenge" awards, moving beyond peer review, and steering support toward individual "blue-sky" researchers who select their own host institutions.</w:t>
+        <w:rPr>
+          <w:b/>
+        </w:rPr>
+        <w:t>What to watch:</w:t>
       </w:r>
-    </w:p>
-    <w:p>
       <w:r>
-        <w:t>*Grant terminations*</w:t>
-      </w:r>
-    </w:p>
-    <w:p>
-      <w:r>
-        <w:t>- NIH resumed canceling grants that conflict with administration priorities, despite prior court rulings; active and pending awards on sensitive topics face renewed termination risk.</w:t>
-      </w:r>
-    </w:p>
-    <w:p>
-      <w:r>
-        <w:t>- Court records exposed the specific automated keyword lists (diversity, gender, COVID terms) used to terminate roughly $2B in University of California grants, now challenged as unconstitutional. These lists allow us to proactively audit our portfolio and proposal language for exposure.</w:t>
-      </w:r>
-    </w:p>
-    <w:p>
-      <w:r>
-        <w:t>*Compliance and research security*</w:t>
-      </w:r>
-    </w:p>
-    <w:p>
-      <w:r>
-        <w:t>- NIH issued notice NOT-OD-26-101 establishing USG policy for stopping high-risk life sciences research; oversight, biosafety, and compliance offices should assess implications for affected labs and awards.</w:t>
-      </w:r>
-    </w:p>
-    <w:p>
-      <w:r>
-        <w:t>- HHS rescinded portions of its Title VI civil rights regulations to conform to Executive Order 14281, which may narrow compliance obligations tied to federal funding.</w:t>
-      </w:r>
-    </w:p>
-    <w:p>
-      <w:r>
-        <w:t>- DoD added Fudan and Shanghai Jiao Tong—leading civilian institutions—to its threat list, potentially complicating collaborations.</w:t>
-      </w:r>
-    </w:p>
-    <w:p>
-      <w:r>
-        <w:t>- Separately, FDA finalized three routine cancer clinical-trial eligibility guidances relevant to IRBs and oncology investigators.</w:t>
-      </w:r>
-    </w:p>
-    <w:p>
-      <w:r>
-        <w:t>**What to watch:** Agency implementation plans due within 90 days will clarify how funding restructuring translates into practice. Monitor litigation over keyword-based terminations and the forthcoming scope of the high-risk life sciences policy.</w:t>
+        <w:t xml:space="preserve"> Agency implementation plans due within 90 days will clarify how funding restructuring translates into practice, and further NIH terminations should be anticipated as administration priorities take hold.</w:t>
       </w:r>
     </w:p>
     <w:p>

</xml_diff>